<commit_message>
PowerBI Lab2 pbix update
</commit_message>
<xml_diff>
--- a/PowerBI_Lab2/Task2.docx
+++ b/PowerBI_Lab2/Task2.docx
@@ -28,21 +28,7 @@
         <w:rPr>
           <w:rFonts w:ascii="Arial" w:hAnsi="Arial" w:cs="Arial"/>
         </w:rPr>
-        <w:t xml:space="preserve">Add a Slicer. It should contain Full Name from </w:t>
-      </w:r>
-      <w:proofErr w:type="spellStart"/>
-      <w:r>
-        <w:rPr>
-          <w:rFonts w:ascii="Arial" w:hAnsi="Arial" w:cs="Arial"/>
-        </w:rPr>
-        <w:t>DimCustomer</w:t>
-      </w:r>
-      <w:proofErr w:type="spellEnd"/>
-      <w:r>
-        <w:rPr>
-          <w:rFonts w:ascii="Arial" w:hAnsi="Arial" w:cs="Arial"/>
-        </w:rPr>
-        <w:t xml:space="preserve"> table. Try to have in two types – List and Dropdown. Add Search to the slicers, since there are a lot of customers, so let’s simplify user experience.</w:t>
+        <w:t>Add a Slicer. It should contain Full Name from DimCustomer table. Try to have in two types – List and Dropdown. Add Search to the slicers, since there are a lot of customers, so let’s simplify user experience.</w:t>
       </w:r>
     </w:p>
     <w:p/>
@@ -326,7 +312,6 @@
         </w:rPr>
         <w:t xml:space="preserve">Disabled interactions between Product Category slicer – </w:t>
       </w:r>
-      <w:proofErr w:type="spellStart"/>
       <w:r>
         <w:rPr>
           <w:rStyle w:val="HTMLCode"/>
@@ -336,7 +321,6 @@
         </w:rPr>
         <w:t>EnglishProductCategoryName</w:t>
       </w:r>
-      <w:proofErr w:type="spellEnd"/>
       <w:r>
         <w:rPr>
           <w:rStyle w:val="HTMLCode"/>
@@ -368,23 +352,7 @@
           <w:sz w:val="28"/>
           <w:szCs w:val="28"/>
         </w:rPr>
-        <w:t xml:space="preserve">Bullet Chart – Sum of </w:t>
-      </w:r>
-      <w:proofErr w:type="spellStart"/>
-      <w:r>
-        <w:rPr>
-          <w:sz w:val="28"/>
-          <w:szCs w:val="28"/>
-        </w:rPr>
-        <w:t>SalesAmount</w:t>
-      </w:r>
-      <w:proofErr w:type="spellEnd"/>
-      <w:r>
-        <w:rPr>
-          <w:sz w:val="28"/>
-          <w:szCs w:val="28"/>
-        </w:rPr>
-        <w:t xml:space="preserve"> and Sales Target</w:t>
+        <w:t>Bullet Chart – Sum of SalesAmount and Sales Target</w:t>
       </w:r>
     </w:p>
     <w:p>
@@ -499,27 +467,16 @@
       </w:pPr>
       <w:r>
         <w:lastRenderedPageBreak/>
-        <w:t xml:space="preserve">Add and configure a Map visual to the report. Add necessary tables from the </w:t>
-      </w:r>
-      <w:proofErr w:type="spellStart"/>
-      <w:r>
-        <w:t>AdventureWorks</w:t>
-      </w:r>
-      <w:proofErr w:type="spellEnd"/>
-      <w:r>
-        <w:t xml:space="preserve"> DWH if needed.</w:t>
-      </w:r>
-    </w:p>
-    <w:p>
-      <w:r>
-        <w:rPr>
-          <w:noProof/>
-        </w:rPr>
+        <w:t>Add and configure a Map visual to the report. Add necessary tables from the AdventureWorks DWH if needed.</w:t>
+      </w:r>
+    </w:p>
+    <w:p>
+      <w:r>
         <w:drawing>
-          <wp:inline distT="0" distB="0" distL="0" distR="0" wp14:anchorId="16C73A83" wp14:editId="03856D9C">
-            <wp:extent cx="5943600" cy="3384550"/>
+          <wp:inline distT="0" distB="0" distL="0" distR="0" wp14:anchorId="4C8079D4" wp14:editId="1B9904B5">
+            <wp:extent cx="5943600" cy="3327400"/>
             <wp:effectExtent l="0" t="0" r="0" b="6350"/>
-            <wp:docPr id="8" name="Picture 8"/>
+            <wp:docPr id="16" name="Picture 16"/>
             <wp:cNvGraphicFramePr>
               <a:graphicFrameLocks xmlns:a="http://schemas.openxmlformats.org/drawingml/2006/main" noChangeAspect="1"/>
             </wp:cNvGraphicFramePr>
@@ -539,7 +496,7 @@
                   <pic:spPr>
                     <a:xfrm>
                       <a:off x="0" y="0"/>
-                      <a:ext cx="5943600" cy="3384550"/>
+                      <a:ext cx="5943600" cy="3327400"/>
                     </a:xfrm>
                     <a:prstGeom prst="rect">
                       <a:avLst/>
@@ -878,6 +835,9 @@
     <w:p/>
     <w:p>
       <w:r>
+        <w:rPr>
+          <w:noProof/>
+        </w:rPr>
         <w:lastRenderedPageBreak/>
         <w:drawing>
           <wp:inline distT="0" distB="0" distL="0" distR="0" wp14:anchorId="1ED56531" wp14:editId="66BCF9DF">
@@ -931,6 +891,9 @@
     </w:p>
     <w:p>
       <w:r>
+        <w:rPr>
+          <w:noProof/>
+        </w:rPr>
         <w:drawing>
           <wp:inline distT="0" distB="0" distL="0" distR="0" wp14:anchorId="5BFADFD8" wp14:editId="15B7FA1F">
             <wp:extent cx="5943600" cy="3378200"/>

</xml_diff>